<commit_message>
- fcts authentification - fcts de recevoir tous les voitures
</commit_message>
<xml_diff>
--- a/documents-resources/Insructions-suivre.docx
+++ b/documents-resources/Insructions-suivre.docx
@@ -542,6 +542,928 @@
         </w:rPr>
         <w:t>Changer la disponibilité du voiture lors de paiement de reservation et lors de termine du date de reservation</w:t>
       </w:r>
+    </w:p>
+    <w:p>
+      <w:pPr>
+        <w:rPr>
+          <w:lang w:val="fr-MA"/>
+        </w:rPr>
+      </w:pPr>
+    </w:p>
+    <w:p>
+      <w:pPr>
+        <w:jc w:val="both"/>
+        <w:rPr>
+          <w:lang w:val="fr-MA"/>
+        </w:rPr>
+      </w:pPr>
+      <w:r>
+        <w:rPr>
+          <w:lang w:val="fr-MA"/>
+        </w:rPr>
+        <w:br w:type="page"/>
+      </w:r>
+    </w:p>
+    <w:p>
+      <w:pPr>
+        <w:rPr>
+          <w:lang w:val="fr-MA"/>
+        </w:rPr>
+      </w:pPr>
+    </w:p>
+    <w:p>
+      <w:pPr>
+        <w:rPr>
+          <w:b/>
+          <w:bCs/>
+          <w:sz w:val="28"/>
+          <w:szCs w:val="24"/>
+          <w:u w:val="single"/>
+          <w:lang w:val="fr-MA"/>
+        </w:rPr>
+      </w:pPr>
+      <w:r>
+        <w:rPr>
+          <w:b/>
+          <w:bCs/>
+          <w:sz w:val="28"/>
+          <w:szCs w:val="24"/>
+          <w:u w:val="single"/>
+          <w:lang w:val="fr-MA"/>
+        </w:rPr>
+        <w:t>Programme :</w:t>
+      </w:r>
+    </w:p>
+    <w:p>
+      <w:pPr>
+        <w:pStyle w:val="Paragraphedeliste"/>
+        <w:numPr>
+          <w:ilvl w:val="0"/>
+          <w:numId w:val="4"/>
+        </w:numPr>
+        <w:rPr>
+          <w:b/>
+          <w:bCs/>
+          <w:lang w:val="fr-MA"/>
+        </w:rPr>
+      </w:pPr>
+      <w:r>
+        <w:rPr>
+          <w:b/>
+          <w:bCs/>
+          <w:lang w:val="fr-MA"/>
+        </w:rPr>
+        <w:t>Page d’accueil :</w:t>
+      </w:r>
+    </w:p>
+    <w:p>
+      <w:pPr>
+        <w:pStyle w:val="Paragraphedeliste"/>
+        <w:numPr>
+          <w:ilvl w:val="0"/>
+          <w:numId w:val="3"/>
+        </w:numPr>
+        <w:rPr>
+          <w:lang w:val="fr-MA"/>
+        </w:rPr>
+      </w:pPr>
+      <w:r>
+        <w:rPr>
+          <w:lang w:val="fr-MA"/>
+        </w:rPr>
+        <w:t xml:space="preserve">Terminer Section à propos de nous : </w:t>
+      </w:r>
+      <w:r>
+        <w:rPr>
+          <w:color w:val="FF0000"/>
+          <w:lang w:val="fr-MA"/>
+        </w:rPr>
+        <w:t>Yahya</w:t>
+      </w:r>
+    </w:p>
+    <w:p>
+      <w:pPr>
+        <w:pStyle w:val="Paragraphedeliste"/>
+        <w:numPr>
+          <w:ilvl w:val="0"/>
+          <w:numId w:val="3"/>
+        </w:numPr>
+        <w:rPr>
+          <w:lang w:val="fr-MA"/>
+        </w:rPr>
+      </w:pPr>
+      <w:r>
+        <w:rPr>
+          <w:lang w:val="fr-MA"/>
+        </w:rPr>
+        <w:t xml:space="preserve">Footer : </w:t>
+      </w:r>
+      <w:r>
+        <w:rPr>
+          <w:color w:val="FF0000"/>
+          <w:lang w:val="fr-MA"/>
+        </w:rPr>
+        <w:t>Abdlatif</w:t>
+      </w:r>
+    </w:p>
+    <w:p>
+      <w:pPr>
+        <w:pStyle w:val="Paragraphedeliste"/>
+        <w:numPr>
+          <w:ilvl w:val="0"/>
+          <w:numId w:val="4"/>
+        </w:numPr>
+        <w:rPr>
+          <w:b/>
+          <w:bCs/>
+          <w:lang w:val="fr-MA"/>
+        </w:rPr>
+      </w:pPr>
+      <w:r>
+        <w:rPr>
+          <w:b/>
+          <w:bCs/>
+          <w:lang w:val="fr-MA"/>
+        </w:rPr>
+        <w:t>Pages de connexios :</w:t>
+      </w:r>
+      <w:r>
+        <w:rPr>
+          <w:b/>
+          <w:bCs/>
+          <w:lang w:val="fr-MA"/>
+        </w:rPr>
+        <w:t xml:space="preserve"> </w:t>
+      </w:r>
+    </w:p>
+    <w:p>
+      <w:pPr>
+        <w:pStyle w:val="Paragraphedeliste"/>
+        <w:numPr>
+          <w:ilvl w:val="0"/>
+          <w:numId w:val="3"/>
+        </w:numPr>
+        <w:rPr>
+          <w:lang w:val="fr-MA"/>
+        </w:rPr>
+      </w:pPr>
+      <w:r>
+        <w:rPr>
+          <w:lang w:val="fr-MA"/>
+        </w:rPr>
+        <w:t>Formulaire d’inscription</w:t>
+      </w:r>
+      <w:r>
+        <w:rPr>
+          <w:lang w:val="fr-MA"/>
+        </w:rPr>
+        <w:t xml:space="preserve"> : </w:t>
+      </w:r>
+      <w:r>
+        <w:rPr>
+          <w:color w:val="FF0000"/>
+          <w:lang w:val="fr-MA"/>
+        </w:rPr>
+        <w:t>Abdlhadi</w:t>
+      </w:r>
+    </w:p>
+    <w:p>
+      <w:pPr>
+        <w:pStyle w:val="Paragraphedeliste"/>
+        <w:numPr>
+          <w:ilvl w:val="0"/>
+          <w:numId w:val="3"/>
+        </w:numPr>
+        <w:rPr>
+          <w:lang w:val="fr-MA"/>
+        </w:rPr>
+      </w:pPr>
+      <w:r>
+        <w:rPr>
+          <w:lang w:val="fr-MA"/>
+        </w:rPr>
+        <w:t>Formulaire de connexion</w:t>
+      </w:r>
+      <w:r>
+        <w:rPr>
+          <w:lang w:val="fr-MA"/>
+        </w:rPr>
+        <w:t xml:space="preserve"> : </w:t>
+      </w:r>
+      <w:r>
+        <w:rPr>
+          <w:color w:val="FF0000"/>
+          <w:lang w:val="fr-MA"/>
+        </w:rPr>
+        <w:t>Abdlhadi</w:t>
+      </w:r>
+    </w:p>
+    <w:p>
+      <w:pPr>
+        <w:pStyle w:val="Paragraphedeliste"/>
+        <w:numPr>
+          <w:ilvl w:val="0"/>
+          <w:numId w:val="3"/>
+        </w:numPr>
+        <w:rPr>
+          <w:lang w:val="fr-MA"/>
+        </w:rPr>
+      </w:pPr>
+      <w:r>
+        <w:rPr>
+          <w:lang w:val="fr-MA"/>
+        </w:rPr>
+        <w:t xml:space="preserve">Fonctions Laravel de connexion : </w:t>
+      </w:r>
+      <w:r>
+        <w:rPr>
+          <w:color w:val="FF0000"/>
+          <w:lang w:val="fr-MA"/>
+        </w:rPr>
+        <w:t>Hamza</w:t>
+      </w:r>
+    </w:p>
+    <w:p>
+      <w:pPr>
+        <w:pStyle w:val="Paragraphedeliste"/>
+        <w:numPr>
+          <w:ilvl w:val="0"/>
+          <w:numId w:val="3"/>
+        </w:numPr>
+        <w:rPr>
+          <w:lang w:val="fr-MA"/>
+        </w:rPr>
+      </w:pPr>
+      <w:r>
+        <w:rPr>
+          <w:lang w:val="fr-MA"/>
+        </w:rPr>
+        <w:t xml:space="preserve">Fonctions JS de changement des données : </w:t>
+      </w:r>
+      <w:r>
+        <w:rPr>
+          <w:color w:val="FF0000"/>
+          <w:lang w:val="fr-MA"/>
+        </w:rPr>
+        <w:t>Hamza</w:t>
+      </w:r>
+    </w:p>
+    <w:p>
+      <w:pPr>
+        <w:pStyle w:val="Paragraphedeliste"/>
+        <w:numPr>
+          <w:ilvl w:val="0"/>
+          <w:numId w:val="4"/>
+        </w:numPr>
+        <w:rPr>
+          <w:b/>
+          <w:bCs/>
+          <w:lang w:val="fr-MA"/>
+        </w:rPr>
+      </w:pPr>
+      <w:r>
+        <w:rPr>
+          <w:b/>
+          <w:bCs/>
+          <w:lang w:val="fr-MA"/>
+        </w:rPr>
+        <w:t>Page de voitures :</w:t>
+      </w:r>
+    </w:p>
+    <w:p>
+      <w:pPr>
+        <w:pStyle w:val="Paragraphedeliste"/>
+        <w:numPr>
+          <w:ilvl w:val="0"/>
+          <w:numId w:val="3"/>
+        </w:numPr>
+        <w:rPr>
+          <w:lang w:val="fr-MA"/>
+        </w:rPr>
+      </w:pPr>
+      <w:r>
+        <w:rPr>
+          <w:lang w:val="fr-MA"/>
+        </w:rPr>
+        <w:t xml:space="preserve">Navbar : </w:t>
+      </w:r>
+      <w:r>
+        <w:rPr>
+          <w:color w:val="FF0000"/>
+          <w:lang w:val="fr-MA"/>
+        </w:rPr>
+        <w:t>Hamza</w:t>
+      </w:r>
+    </w:p>
+    <w:p>
+      <w:pPr>
+        <w:pStyle w:val="Paragraphedeliste"/>
+        <w:numPr>
+          <w:ilvl w:val="0"/>
+          <w:numId w:val="3"/>
+        </w:numPr>
+        <w:rPr>
+          <w:lang w:val="fr-MA"/>
+        </w:rPr>
+      </w:pPr>
+      <w:r>
+        <w:rPr>
+          <w:lang w:val="fr-MA"/>
+        </w:rPr>
+        <w:t>Fonction</w:t>
+      </w:r>
+      <w:r>
+        <w:rPr>
+          <w:lang w:val="fr-MA"/>
+        </w:rPr>
+        <w:t>s Laravel</w:t>
+      </w:r>
+      <w:r>
+        <w:rPr>
+          <w:lang w:val="fr-MA"/>
+        </w:rPr>
+        <w:t xml:space="preserve"> pour recevoir les voitures : </w:t>
+      </w:r>
+      <w:r>
+        <w:rPr>
+          <w:color w:val="FF0000"/>
+          <w:lang w:val="fr-MA"/>
+        </w:rPr>
+        <w:t>Hamza</w:t>
+      </w:r>
+    </w:p>
+    <w:p>
+      <w:pPr>
+        <w:pStyle w:val="Paragraphedeliste"/>
+        <w:numPr>
+          <w:ilvl w:val="0"/>
+          <w:numId w:val="3"/>
+        </w:numPr>
+        <w:rPr>
+          <w:lang w:val="fr-MA"/>
+        </w:rPr>
+      </w:pPr>
+      <w:r>
+        <w:rPr>
+          <w:lang w:val="fr-MA"/>
+        </w:rPr>
+        <w:t xml:space="preserve">Inputs pour filtrage des voitures (marque,prix,disponibilité …) : </w:t>
+      </w:r>
+      <w:r>
+        <w:rPr>
+          <w:color w:val="FF0000"/>
+          <w:lang w:val="fr-MA"/>
+        </w:rPr>
+        <w:t>Yahya</w:t>
+      </w:r>
+    </w:p>
+    <w:p>
+      <w:pPr>
+        <w:pStyle w:val="Paragraphedeliste"/>
+        <w:numPr>
+          <w:ilvl w:val="0"/>
+          <w:numId w:val="3"/>
+        </w:numPr>
+        <w:rPr>
+          <w:lang w:val="fr-MA"/>
+        </w:rPr>
+      </w:pPr>
+      <w:r>
+        <w:rPr>
+          <w:lang w:val="fr-MA"/>
+        </w:rPr>
+        <w:t xml:space="preserve">Card d’une voiture : </w:t>
+      </w:r>
+      <w:r>
+        <w:rPr>
+          <w:color w:val="FF0000"/>
+          <w:lang w:val="fr-MA"/>
+        </w:rPr>
+        <w:t>Yahya</w:t>
+      </w:r>
+    </w:p>
+    <w:p>
+      <w:pPr>
+        <w:pStyle w:val="Paragraphedeliste"/>
+        <w:rPr>
+          <w:lang w:val="fr-MA"/>
+        </w:rPr>
+      </w:pPr>
+    </w:p>
+    <w:p>
+      <w:pPr>
+        <w:pStyle w:val="Paragraphedeliste"/>
+        <w:numPr>
+          <w:ilvl w:val="0"/>
+          <w:numId w:val="4"/>
+        </w:numPr>
+        <w:rPr>
+          <w:b/>
+          <w:bCs/>
+          <w:color w:val="00B050"/>
+          <w:sz w:val="28"/>
+          <w:szCs w:val="24"/>
+          <w:lang w:val="fr-MA"/>
+        </w:rPr>
+      </w:pPr>
+      <w:r>
+        <w:rPr>
+          <w:b/>
+          <w:bCs/>
+          <w:color w:val="00B050"/>
+          <w:sz w:val="28"/>
+          <w:szCs w:val="24"/>
+          <w:lang w:val="fr-MA"/>
+        </w:rPr>
+        <w:t>Réunion Dimanche à 18 : 00 :</w:t>
+      </w:r>
+    </w:p>
+    <w:p>
+      <w:pPr>
+        <w:pStyle w:val="Paragraphedeliste"/>
+        <w:numPr>
+          <w:ilvl w:val="0"/>
+          <w:numId w:val="3"/>
+        </w:numPr>
+        <w:rPr>
+          <w:lang w:val="fr-MA"/>
+        </w:rPr>
+      </w:pPr>
+      <w:r>
+        <w:rPr>
+          <w:lang w:val="fr-MA"/>
+        </w:rPr>
+        <w:t xml:space="preserve">Lier les données des voitures reçu à la page des voitures : </w:t>
+      </w:r>
+      <w:r>
+        <w:rPr>
+          <w:color w:val="FF0000"/>
+          <w:lang w:val="fr-MA"/>
+        </w:rPr>
+        <w:t>Hamza</w:t>
+      </w:r>
+    </w:p>
+    <w:p>
+      <w:pPr>
+        <w:pStyle w:val="Paragraphedeliste"/>
+        <w:numPr>
+          <w:ilvl w:val="0"/>
+          <w:numId w:val="3"/>
+        </w:numPr>
+        <w:rPr>
+          <w:lang w:val="fr-MA"/>
+        </w:rPr>
+      </w:pPr>
+      <w:r>
+        <w:rPr>
+          <w:lang w:val="fr-MA"/>
+        </w:rPr>
+        <w:t>Ajouter le fonctionnement aux formulaires de connexion</w:t>
+      </w:r>
+      <w:r>
+        <w:rPr>
+          <w:lang w:val="fr-MA"/>
+        </w:rPr>
+        <w:t xml:space="preserve"> (Insciption et Connexion )</w:t>
+      </w:r>
+      <w:r>
+        <w:rPr>
+          <w:lang w:val="fr-MA"/>
+        </w:rPr>
+        <w:t xml:space="preserve"> et redirection vers l’espace client ou admin selon le role.</w:t>
+      </w:r>
+    </w:p>
+    <w:p>
+      <w:pPr>
+        <w:pStyle w:val="Paragraphedeliste"/>
+        <w:numPr>
+          <w:ilvl w:val="0"/>
+          <w:numId w:val="3"/>
+        </w:numPr>
+        <w:rPr>
+          <w:lang w:val="fr-MA"/>
+        </w:rPr>
+      </w:pPr>
+      <w:r>
+        <w:rPr>
+          <w:lang w:val="fr-MA"/>
+        </w:rPr>
+        <w:t>Création des dossiers admin et client et leur fichiers</w:t>
+      </w:r>
+    </w:p>
+    <w:p>
+      <w:pPr>
+        <w:pStyle w:val="Paragraphedeliste"/>
+        <w:rPr>
+          <w:lang w:val="fr-MA"/>
+        </w:rPr>
+      </w:pPr>
+    </w:p>
+    <w:p>
+      <w:pPr>
+        <w:pStyle w:val="Paragraphedeliste"/>
+        <w:numPr>
+          <w:ilvl w:val="0"/>
+          <w:numId w:val="4"/>
+        </w:numPr>
+        <w:rPr>
+          <w:b/>
+          <w:bCs/>
+          <w:lang w:val="fr-MA"/>
+        </w:rPr>
+      </w:pPr>
+      <w:r>
+        <w:rPr>
+          <w:b/>
+          <w:bCs/>
+          <w:lang w:val="fr-MA"/>
+        </w:rPr>
+        <w:t>Espace</w:t>
+      </w:r>
+      <w:r>
+        <w:rPr>
+          <w:b/>
+          <w:bCs/>
+          <w:lang w:val="fr-MA"/>
+        </w:rPr>
+        <w:t xml:space="preserve"> Admin :</w:t>
+      </w:r>
+    </w:p>
+    <w:p>
+      <w:pPr>
+        <w:pStyle w:val="Paragraphedeliste"/>
+        <w:numPr>
+          <w:ilvl w:val="0"/>
+          <w:numId w:val="3"/>
+        </w:numPr>
+        <w:rPr>
+          <w:lang w:val="fr-MA"/>
+        </w:rPr>
+      </w:pPr>
+      <w:r>
+        <w:rPr>
+          <w:lang w:val="fr-MA"/>
+        </w:rPr>
+        <w:t>Navbar</w:t>
+      </w:r>
+    </w:p>
+    <w:p>
+      <w:pPr>
+        <w:pStyle w:val="Paragraphedeliste"/>
+        <w:numPr>
+          <w:ilvl w:val="0"/>
+          <w:numId w:val="3"/>
+        </w:numPr>
+        <w:rPr>
+          <w:lang w:val="fr-MA"/>
+        </w:rPr>
+      </w:pPr>
+      <w:r>
+        <w:rPr>
+          <w:lang w:val="fr-MA"/>
+        </w:rPr>
+        <w:t>Dashboard</w:t>
+      </w:r>
+    </w:p>
+    <w:p>
+      <w:pPr>
+        <w:pStyle w:val="Paragraphedeliste"/>
+        <w:numPr>
+          <w:ilvl w:val="0"/>
+          <w:numId w:val="3"/>
+        </w:numPr>
+        <w:rPr>
+          <w:lang w:val="fr-MA"/>
+        </w:rPr>
+      </w:pPr>
+      <w:r>
+        <w:rPr>
+          <w:lang w:val="fr-MA"/>
+        </w:rPr>
+        <w:t>Pages voitures :</w:t>
+      </w:r>
+    </w:p>
+    <w:p>
+      <w:pPr>
+        <w:pStyle w:val="Paragraphedeliste"/>
+        <w:numPr>
+          <w:ilvl w:val="0"/>
+          <w:numId w:val="6"/>
+        </w:numPr>
+        <w:rPr>
+          <w:lang w:val="fr-MA"/>
+        </w:rPr>
+      </w:pPr>
+      <w:r>
+        <w:rPr>
+          <w:lang w:val="fr-MA"/>
+        </w:rPr>
+        <w:t>Button et formulaire pour ajouter une voiture</w:t>
+      </w:r>
+    </w:p>
+    <w:p>
+      <w:pPr>
+        <w:pStyle w:val="Paragraphedeliste"/>
+        <w:numPr>
+          <w:ilvl w:val="0"/>
+          <w:numId w:val="6"/>
+        </w:numPr>
+        <w:rPr>
+          <w:lang w:val="fr-MA"/>
+        </w:rPr>
+      </w:pPr>
+      <w:r>
+        <w:rPr>
+          <w:lang w:val="fr-MA"/>
+        </w:rPr>
+        <w:t>Cards des voitures avec buttons : voir details, modifier,supprimer</w:t>
+      </w:r>
+    </w:p>
+    <w:p>
+      <w:pPr>
+        <w:pStyle w:val="Paragraphedeliste"/>
+        <w:numPr>
+          <w:ilvl w:val="0"/>
+          <w:numId w:val="3"/>
+        </w:numPr>
+        <w:rPr>
+          <w:lang w:val="fr-MA"/>
+        </w:rPr>
+      </w:pPr>
+      <w:r>
+        <w:rPr>
+          <w:lang w:val="fr-MA"/>
+        </w:rPr>
+        <w:t>Pages des demandes :</w:t>
+      </w:r>
+    </w:p>
+    <w:p>
+      <w:pPr>
+        <w:pStyle w:val="Paragraphedeliste"/>
+        <w:numPr>
+          <w:ilvl w:val="0"/>
+          <w:numId w:val="7"/>
+        </w:numPr>
+        <w:rPr>
+          <w:lang w:val="fr-MA"/>
+        </w:rPr>
+      </w:pPr>
+      <w:r>
+        <w:rPr>
+          <w:lang w:val="fr-MA"/>
+        </w:rPr>
+        <w:t xml:space="preserve">Afficher tous les demandes des clients avec buttons : </w:t>
+      </w:r>
+      <w:r>
+        <w:rPr>
+          <w:lang w:val="fr-MA"/>
+        </w:rPr>
+        <w:t xml:space="preserve">voir details, </w:t>
+      </w:r>
+      <w:r>
+        <w:rPr>
+          <w:lang w:val="fr-MA"/>
+        </w:rPr>
+        <w:t>accepter</w:t>
+      </w:r>
+      <w:r>
+        <w:rPr>
+          <w:lang w:val="fr-MA"/>
+        </w:rPr>
+        <w:t>,</w:t>
+      </w:r>
+      <w:r>
+        <w:rPr>
+          <w:lang w:val="fr-MA"/>
+        </w:rPr>
+        <w:t>refuser</w:t>
+      </w:r>
+    </w:p>
+    <w:p>
+      <w:pPr>
+        <w:pStyle w:val="Paragraphedeliste"/>
+        <w:numPr>
+          <w:ilvl w:val="0"/>
+          <w:numId w:val="4"/>
+        </w:numPr>
+        <w:rPr>
+          <w:b/>
+          <w:bCs/>
+          <w:lang w:val="fr-MA"/>
+        </w:rPr>
+      </w:pPr>
+      <w:r>
+        <w:rPr>
+          <w:b/>
+          <w:bCs/>
+          <w:lang w:val="fr-MA"/>
+        </w:rPr>
+        <w:t>Espace</w:t>
+      </w:r>
+      <w:r>
+        <w:rPr>
+          <w:b/>
+          <w:bCs/>
+          <w:lang w:val="fr-MA"/>
+        </w:rPr>
+        <w:t xml:space="preserve"> </w:t>
+      </w:r>
+      <w:r>
+        <w:rPr>
+          <w:b/>
+          <w:bCs/>
+          <w:lang w:val="fr-MA"/>
+        </w:rPr>
+        <w:t>Client</w:t>
+      </w:r>
+      <w:r>
+        <w:rPr>
+          <w:b/>
+          <w:bCs/>
+          <w:lang w:val="fr-MA"/>
+        </w:rPr>
+        <w:t> :</w:t>
+      </w:r>
+    </w:p>
+    <w:p>
+      <w:pPr>
+        <w:pStyle w:val="Paragraphedeliste"/>
+        <w:numPr>
+          <w:ilvl w:val="0"/>
+          <w:numId w:val="3"/>
+        </w:numPr>
+        <w:rPr>
+          <w:lang w:val="fr-MA"/>
+        </w:rPr>
+      </w:pPr>
+      <w:r>
+        <w:rPr>
+          <w:lang w:val="fr-MA"/>
+        </w:rPr>
+        <w:t>Navbar</w:t>
+      </w:r>
+    </w:p>
+    <w:p>
+      <w:pPr>
+        <w:pStyle w:val="Paragraphedeliste"/>
+        <w:numPr>
+          <w:ilvl w:val="0"/>
+          <w:numId w:val="3"/>
+        </w:numPr>
+        <w:rPr>
+          <w:lang w:val="fr-MA"/>
+        </w:rPr>
+      </w:pPr>
+      <w:r>
+        <w:rPr>
+          <w:lang w:val="fr-MA"/>
+        </w:rPr>
+        <w:t>Dashboard</w:t>
+      </w:r>
+    </w:p>
+    <w:p>
+      <w:pPr>
+        <w:pStyle w:val="Paragraphedeliste"/>
+        <w:numPr>
+          <w:ilvl w:val="0"/>
+          <w:numId w:val="3"/>
+        </w:numPr>
+        <w:rPr>
+          <w:lang w:val="fr-MA"/>
+        </w:rPr>
+      </w:pPr>
+      <w:r>
+        <w:rPr>
+          <w:lang w:val="fr-MA"/>
+        </w:rPr>
+        <w:t>Pages voitures :</w:t>
+      </w:r>
+    </w:p>
+    <w:p>
+      <w:pPr>
+        <w:pStyle w:val="Paragraphedeliste"/>
+        <w:numPr>
+          <w:ilvl w:val="0"/>
+          <w:numId w:val="7"/>
+        </w:numPr>
+        <w:rPr>
+          <w:lang w:val="fr-MA"/>
+        </w:rPr>
+      </w:pPr>
+      <w:r>
+        <w:rPr>
+          <w:lang w:val="fr-MA"/>
+        </w:rPr>
+        <w:t xml:space="preserve">Cards des voitures avec buttons : voir details, </w:t>
+      </w:r>
+      <w:r>
+        <w:rPr>
+          <w:lang w:val="fr-MA"/>
+        </w:rPr>
+        <w:t>louer</w:t>
+      </w:r>
+    </w:p>
+    <w:p>
+      <w:pPr>
+        <w:pStyle w:val="Paragraphedeliste"/>
+        <w:numPr>
+          <w:ilvl w:val="0"/>
+          <w:numId w:val="7"/>
+        </w:numPr>
+        <w:rPr>
+          <w:lang w:val="fr-MA"/>
+        </w:rPr>
+      </w:pPr>
+      <w:r>
+        <w:rPr>
+          <w:lang w:val="fr-MA"/>
+        </w:rPr>
+        <w:t>Fomulaire pour remplir les infos de la location de la voiture</w:t>
+      </w:r>
+    </w:p>
+    <w:p>
+      <w:pPr>
+        <w:pStyle w:val="Paragraphedeliste"/>
+        <w:numPr>
+          <w:ilvl w:val="0"/>
+          <w:numId w:val="3"/>
+        </w:numPr>
+        <w:rPr>
+          <w:lang w:val="fr-MA"/>
+        </w:rPr>
+      </w:pPr>
+      <w:r>
+        <w:rPr>
+          <w:lang w:val="fr-MA"/>
+        </w:rPr>
+        <w:t>Pages des demandes :</w:t>
+      </w:r>
+    </w:p>
+    <w:p>
+      <w:pPr>
+        <w:pStyle w:val="Paragraphedeliste"/>
+        <w:numPr>
+          <w:ilvl w:val="0"/>
+          <w:numId w:val="7"/>
+        </w:numPr>
+        <w:rPr>
+          <w:lang w:val="fr-MA"/>
+        </w:rPr>
+      </w:pPr>
+      <w:r>
+        <w:rPr>
+          <w:lang w:val="fr-MA"/>
+        </w:rPr>
+        <w:t xml:space="preserve">Afficher </w:t>
+      </w:r>
+      <w:r>
+        <w:rPr>
+          <w:lang w:val="fr-MA"/>
+        </w:rPr>
+        <w:t>tous les demandes du client</w:t>
+      </w:r>
+      <w:r>
+        <w:rPr>
+          <w:lang w:val="fr-MA"/>
+        </w:rPr>
+        <w:t xml:space="preserve"> avec </w:t>
+      </w:r>
+      <w:r>
+        <w:rPr>
+          <w:lang w:val="fr-MA"/>
+        </w:rPr>
+        <w:t>leur status</w:t>
+      </w:r>
+      <w:r>
+        <w:rPr>
+          <w:lang w:val="fr-MA"/>
+        </w:rPr>
+        <w:t> </w:t>
+      </w:r>
+      <w:r>
+        <w:rPr>
+          <w:lang w:val="fr-MA"/>
+        </w:rPr>
+        <w:t>(accepté ou refuseé</w:t>
+      </w:r>
+      <w:r>
+        <w:rPr>
+          <w:lang w:val="fr-MA"/>
+        </w:rPr>
+        <w:t>) et</w:t>
+      </w:r>
+      <w:r>
+        <w:rPr>
+          <w:lang w:val="fr-MA"/>
+        </w:rPr>
+        <w:t xml:space="preserve"> button</w:t>
+      </w:r>
+      <w:r>
+        <w:rPr>
+          <w:lang w:val="fr-MA"/>
+        </w:rPr>
+        <w:t>s : voir details, annuler</w:t>
+      </w:r>
       <w:bookmarkStart w:id="0" w:name="_GoBack"/>
       <w:bookmarkEnd w:id="0"/>
     </w:p>
@@ -554,13 +1476,28 @@
     </w:p>
     <w:p>
       <w:pPr>
+        <w:pStyle w:val="Paragraphedeliste"/>
+        <w:rPr>
+          <w:lang w:val="fr-MA"/>
+        </w:rPr>
+      </w:pPr>
+    </w:p>
+    <w:p>
+      <w:pPr>
+        <w:rPr>
+          <w:lang w:val="fr-MA"/>
+        </w:rPr>
+      </w:pPr>
+    </w:p>
+    <w:p>
+      <w:pPr>
         <w:rPr>
           <w:lang w:val="fr-MA"/>
         </w:rPr>
       </w:pPr>
     </w:p>
     <w:sectPr>
-      <w:pgSz w:w="11906" w:h="16838" w:code="9"/>
+      <w:pgSz w:w="15840" w:h="24480" w:code="3"/>
       <w:pgMar w:top="720" w:right="720" w:bottom="720" w:left="720" w:header="567" w:footer="567" w:gutter="0"/>
       <w:cols w:space="708"/>
       <w:docGrid w:linePitch="360"/>
@@ -776,7 +1713,7 @@
   <w:abstractNum w:abstractNumId="2" w15:restartNumberingAfterBreak="0">
     <w:nsid w:val="1CF215EC"/>
     <w:multiLevelType w:val="hybridMultilevel"/>
-    <w:tmpl w:val="309A09DA"/>
+    <w:tmpl w:val="D9A4FA90"/>
     <w:lvl w:ilvl="0" w:tplc="61264B18">
       <w:start w:val="1"/>
       <w:numFmt w:val="bullet"/>
@@ -789,101 +1726,529 @@
         <w:rFonts w:ascii="Times New Roman" w:eastAsiaTheme="minorHAnsi" w:hAnsi="Times New Roman" w:cs="Times New Roman" w:hint="default"/>
       </w:rPr>
     </w:lvl>
+    <w:lvl w:ilvl="1" w:tplc="040C0003">
+      <w:start w:val="1"/>
+      <w:numFmt w:val="bullet"/>
+      <w:lvlText w:val="o"/>
+      <w:lvlJc w:val="left"/>
+      <w:pPr>
+        <w:ind w:left="1440" w:hanging="360"/>
+      </w:pPr>
+      <w:rPr>
+        <w:rFonts w:ascii="Courier New" w:hAnsi="Courier New" w:cs="Courier New" w:hint="default"/>
+      </w:rPr>
+    </w:lvl>
+    <w:lvl w:ilvl="2" w:tplc="040C0005" w:tentative="1">
+      <w:start w:val="1"/>
+      <w:numFmt w:val="bullet"/>
+      <w:lvlText w:val=""/>
+      <w:lvlJc w:val="left"/>
+      <w:pPr>
+        <w:ind w:left="2160" w:hanging="360"/>
+      </w:pPr>
+      <w:rPr>
+        <w:rFonts w:ascii="Wingdings" w:hAnsi="Wingdings" w:hint="default"/>
+      </w:rPr>
+    </w:lvl>
+    <w:lvl w:ilvl="3" w:tplc="040C0001" w:tentative="1">
+      <w:start w:val="1"/>
+      <w:numFmt w:val="bullet"/>
+      <w:lvlText w:val=""/>
+      <w:lvlJc w:val="left"/>
+      <w:pPr>
+        <w:ind w:left="2880" w:hanging="360"/>
+      </w:pPr>
+      <w:rPr>
+        <w:rFonts w:ascii="Symbol" w:hAnsi="Symbol" w:hint="default"/>
+      </w:rPr>
+    </w:lvl>
+    <w:lvl w:ilvl="4" w:tplc="040C0003" w:tentative="1">
+      <w:start w:val="1"/>
+      <w:numFmt w:val="bullet"/>
+      <w:lvlText w:val="o"/>
+      <w:lvlJc w:val="left"/>
+      <w:pPr>
+        <w:ind w:left="3600" w:hanging="360"/>
+      </w:pPr>
+      <w:rPr>
+        <w:rFonts w:ascii="Courier New" w:hAnsi="Courier New" w:cs="Courier New" w:hint="default"/>
+      </w:rPr>
+    </w:lvl>
+    <w:lvl w:ilvl="5" w:tplc="040C0005" w:tentative="1">
+      <w:start w:val="1"/>
+      <w:numFmt w:val="bullet"/>
+      <w:lvlText w:val=""/>
+      <w:lvlJc w:val="left"/>
+      <w:pPr>
+        <w:ind w:left="4320" w:hanging="360"/>
+      </w:pPr>
+      <w:rPr>
+        <w:rFonts w:ascii="Wingdings" w:hAnsi="Wingdings" w:hint="default"/>
+      </w:rPr>
+    </w:lvl>
+    <w:lvl w:ilvl="6" w:tplc="040C0001" w:tentative="1">
+      <w:start w:val="1"/>
+      <w:numFmt w:val="bullet"/>
+      <w:lvlText w:val=""/>
+      <w:lvlJc w:val="left"/>
+      <w:pPr>
+        <w:ind w:left="5040" w:hanging="360"/>
+      </w:pPr>
+      <w:rPr>
+        <w:rFonts w:ascii="Symbol" w:hAnsi="Symbol" w:hint="default"/>
+      </w:rPr>
+    </w:lvl>
+    <w:lvl w:ilvl="7" w:tplc="040C0003" w:tentative="1">
+      <w:start w:val="1"/>
+      <w:numFmt w:val="bullet"/>
+      <w:lvlText w:val="o"/>
+      <w:lvlJc w:val="left"/>
+      <w:pPr>
+        <w:ind w:left="5760" w:hanging="360"/>
+      </w:pPr>
+      <w:rPr>
+        <w:rFonts w:ascii="Courier New" w:hAnsi="Courier New" w:cs="Courier New" w:hint="default"/>
+      </w:rPr>
+    </w:lvl>
+    <w:lvl w:ilvl="8" w:tplc="040C0005" w:tentative="1">
+      <w:start w:val="1"/>
+      <w:numFmt w:val="bullet"/>
+      <w:lvlText w:val=""/>
+      <w:lvlJc w:val="left"/>
+      <w:pPr>
+        <w:ind w:left="6480" w:hanging="360"/>
+      </w:pPr>
+      <w:rPr>
+        <w:rFonts w:ascii="Wingdings" w:hAnsi="Wingdings" w:hint="default"/>
+      </w:rPr>
+    </w:lvl>
+  </w:abstractNum>
+  <w:abstractNum w:abstractNumId="3" w15:restartNumberingAfterBreak="0">
+    <w:nsid w:val="33B4376F"/>
+    <w:multiLevelType w:val="hybridMultilevel"/>
+    <w:tmpl w:val="AB36B4D8"/>
+    <w:lvl w:ilvl="0" w:tplc="040C0001">
+      <w:start w:val="1"/>
+      <w:numFmt w:val="bullet"/>
+      <w:lvlText w:val=""/>
+      <w:lvlJc w:val="left"/>
+      <w:pPr>
+        <w:ind w:left="1080" w:hanging="360"/>
+      </w:pPr>
+      <w:rPr>
+        <w:rFonts w:ascii="Symbol" w:hAnsi="Symbol" w:hint="default"/>
+      </w:rPr>
+    </w:lvl>
     <w:lvl w:ilvl="1" w:tplc="040C0003" w:tentative="1">
       <w:start w:val="1"/>
       <w:numFmt w:val="bullet"/>
       <w:lvlText w:val="o"/>
       <w:lvlJc w:val="left"/>
       <w:pPr>
+        <w:ind w:left="1800" w:hanging="360"/>
+      </w:pPr>
+      <w:rPr>
+        <w:rFonts w:ascii="Courier New" w:hAnsi="Courier New" w:cs="Courier New" w:hint="default"/>
+      </w:rPr>
+    </w:lvl>
+    <w:lvl w:ilvl="2" w:tplc="040C0005" w:tentative="1">
+      <w:start w:val="1"/>
+      <w:numFmt w:val="bullet"/>
+      <w:lvlText w:val=""/>
+      <w:lvlJc w:val="left"/>
+      <w:pPr>
+        <w:ind w:left="2520" w:hanging="360"/>
+      </w:pPr>
+      <w:rPr>
+        <w:rFonts w:ascii="Wingdings" w:hAnsi="Wingdings" w:hint="default"/>
+      </w:rPr>
+    </w:lvl>
+    <w:lvl w:ilvl="3" w:tplc="040C0001" w:tentative="1">
+      <w:start w:val="1"/>
+      <w:numFmt w:val="bullet"/>
+      <w:lvlText w:val=""/>
+      <w:lvlJc w:val="left"/>
+      <w:pPr>
+        <w:ind w:left="3240" w:hanging="360"/>
+      </w:pPr>
+      <w:rPr>
+        <w:rFonts w:ascii="Symbol" w:hAnsi="Symbol" w:hint="default"/>
+      </w:rPr>
+    </w:lvl>
+    <w:lvl w:ilvl="4" w:tplc="040C0003" w:tentative="1">
+      <w:start w:val="1"/>
+      <w:numFmt w:val="bullet"/>
+      <w:lvlText w:val="o"/>
+      <w:lvlJc w:val="left"/>
+      <w:pPr>
+        <w:ind w:left="3960" w:hanging="360"/>
+      </w:pPr>
+      <w:rPr>
+        <w:rFonts w:ascii="Courier New" w:hAnsi="Courier New" w:cs="Courier New" w:hint="default"/>
+      </w:rPr>
+    </w:lvl>
+    <w:lvl w:ilvl="5" w:tplc="040C0005" w:tentative="1">
+      <w:start w:val="1"/>
+      <w:numFmt w:val="bullet"/>
+      <w:lvlText w:val=""/>
+      <w:lvlJc w:val="left"/>
+      <w:pPr>
+        <w:ind w:left="4680" w:hanging="360"/>
+      </w:pPr>
+      <w:rPr>
+        <w:rFonts w:ascii="Wingdings" w:hAnsi="Wingdings" w:hint="default"/>
+      </w:rPr>
+    </w:lvl>
+    <w:lvl w:ilvl="6" w:tplc="040C0001" w:tentative="1">
+      <w:start w:val="1"/>
+      <w:numFmt w:val="bullet"/>
+      <w:lvlText w:val=""/>
+      <w:lvlJc w:val="left"/>
+      <w:pPr>
+        <w:ind w:left="5400" w:hanging="360"/>
+      </w:pPr>
+      <w:rPr>
+        <w:rFonts w:ascii="Symbol" w:hAnsi="Symbol" w:hint="default"/>
+      </w:rPr>
+    </w:lvl>
+    <w:lvl w:ilvl="7" w:tplc="040C0003" w:tentative="1">
+      <w:start w:val="1"/>
+      <w:numFmt w:val="bullet"/>
+      <w:lvlText w:val="o"/>
+      <w:lvlJc w:val="left"/>
+      <w:pPr>
+        <w:ind w:left="6120" w:hanging="360"/>
+      </w:pPr>
+      <w:rPr>
+        <w:rFonts w:ascii="Courier New" w:hAnsi="Courier New" w:cs="Courier New" w:hint="default"/>
+      </w:rPr>
+    </w:lvl>
+    <w:lvl w:ilvl="8" w:tplc="040C0005" w:tentative="1">
+      <w:start w:val="1"/>
+      <w:numFmt w:val="bullet"/>
+      <w:lvlText w:val=""/>
+      <w:lvlJc w:val="left"/>
+      <w:pPr>
+        <w:ind w:left="6840" w:hanging="360"/>
+      </w:pPr>
+      <w:rPr>
+        <w:rFonts w:ascii="Wingdings" w:hAnsi="Wingdings" w:hint="default"/>
+      </w:rPr>
+    </w:lvl>
+  </w:abstractNum>
+  <w:abstractNum w:abstractNumId="4" w15:restartNumberingAfterBreak="0">
+    <w:nsid w:val="34612064"/>
+    <w:multiLevelType w:val="hybridMultilevel"/>
+    <w:tmpl w:val="A128F1EA"/>
+    <w:lvl w:ilvl="0" w:tplc="040C0001">
+      <w:start w:val="1"/>
+      <w:numFmt w:val="bullet"/>
+      <w:lvlText w:val=""/>
+      <w:lvlJc w:val="left"/>
+      <w:pPr>
+        <w:ind w:left="1068" w:hanging="360"/>
+      </w:pPr>
+      <w:rPr>
+        <w:rFonts w:ascii="Symbol" w:hAnsi="Symbol" w:hint="default"/>
+      </w:rPr>
+    </w:lvl>
+    <w:lvl w:ilvl="1" w:tplc="040C0003" w:tentative="1">
+      <w:start w:val="1"/>
+      <w:numFmt w:val="bullet"/>
+      <w:lvlText w:val="o"/>
+      <w:lvlJc w:val="left"/>
+      <w:pPr>
+        <w:ind w:left="1788" w:hanging="360"/>
+      </w:pPr>
+      <w:rPr>
+        <w:rFonts w:ascii="Courier New" w:hAnsi="Courier New" w:cs="Courier New" w:hint="default"/>
+      </w:rPr>
+    </w:lvl>
+    <w:lvl w:ilvl="2" w:tplc="040C0005" w:tentative="1">
+      <w:start w:val="1"/>
+      <w:numFmt w:val="bullet"/>
+      <w:lvlText w:val=""/>
+      <w:lvlJc w:val="left"/>
+      <w:pPr>
+        <w:ind w:left="2508" w:hanging="360"/>
+      </w:pPr>
+      <w:rPr>
+        <w:rFonts w:ascii="Wingdings" w:hAnsi="Wingdings" w:hint="default"/>
+      </w:rPr>
+    </w:lvl>
+    <w:lvl w:ilvl="3" w:tplc="040C0001" w:tentative="1">
+      <w:start w:val="1"/>
+      <w:numFmt w:val="bullet"/>
+      <w:lvlText w:val=""/>
+      <w:lvlJc w:val="left"/>
+      <w:pPr>
+        <w:ind w:left="3228" w:hanging="360"/>
+      </w:pPr>
+      <w:rPr>
+        <w:rFonts w:ascii="Symbol" w:hAnsi="Symbol" w:hint="default"/>
+      </w:rPr>
+    </w:lvl>
+    <w:lvl w:ilvl="4" w:tplc="040C0003" w:tentative="1">
+      <w:start w:val="1"/>
+      <w:numFmt w:val="bullet"/>
+      <w:lvlText w:val="o"/>
+      <w:lvlJc w:val="left"/>
+      <w:pPr>
+        <w:ind w:left="3948" w:hanging="360"/>
+      </w:pPr>
+      <w:rPr>
+        <w:rFonts w:ascii="Courier New" w:hAnsi="Courier New" w:cs="Courier New" w:hint="default"/>
+      </w:rPr>
+    </w:lvl>
+    <w:lvl w:ilvl="5" w:tplc="040C0005" w:tentative="1">
+      <w:start w:val="1"/>
+      <w:numFmt w:val="bullet"/>
+      <w:lvlText w:val=""/>
+      <w:lvlJc w:val="left"/>
+      <w:pPr>
+        <w:ind w:left="4668" w:hanging="360"/>
+      </w:pPr>
+      <w:rPr>
+        <w:rFonts w:ascii="Wingdings" w:hAnsi="Wingdings" w:hint="default"/>
+      </w:rPr>
+    </w:lvl>
+    <w:lvl w:ilvl="6" w:tplc="040C0001" w:tentative="1">
+      <w:start w:val="1"/>
+      <w:numFmt w:val="bullet"/>
+      <w:lvlText w:val=""/>
+      <w:lvlJc w:val="left"/>
+      <w:pPr>
+        <w:ind w:left="5388" w:hanging="360"/>
+      </w:pPr>
+      <w:rPr>
+        <w:rFonts w:ascii="Symbol" w:hAnsi="Symbol" w:hint="default"/>
+      </w:rPr>
+    </w:lvl>
+    <w:lvl w:ilvl="7" w:tplc="040C0003" w:tentative="1">
+      <w:start w:val="1"/>
+      <w:numFmt w:val="bullet"/>
+      <w:lvlText w:val="o"/>
+      <w:lvlJc w:val="left"/>
+      <w:pPr>
+        <w:ind w:left="6108" w:hanging="360"/>
+      </w:pPr>
+      <w:rPr>
+        <w:rFonts w:ascii="Courier New" w:hAnsi="Courier New" w:cs="Courier New" w:hint="default"/>
+      </w:rPr>
+    </w:lvl>
+    <w:lvl w:ilvl="8" w:tplc="040C0005" w:tentative="1">
+      <w:start w:val="1"/>
+      <w:numFmt w:val="bullet"/>
+      <w:lvlText w:val=""/>
+      <w:lvlJc w:val="left"/>
+      <w:pPr>
+        <w:ind w:left="6828" w:hanging="360"/>
+      </w:pPr>
+      <w:rPr>
+        <w:rFonts w:ascii="Wingdings" w:hAnsi="Wingdings" w:hint="default"/>
+      </w:rPr>
+    </w:lvl>
+  </w:abstractNum>
+  <w:abstractNum w:abstractNumId="5" w15:restartNumberingAfterBreak="0">
+    <w:nsid w:val="3883446A"/>
+    <w:multiLevelType w:val="hybridMultilevel"/>
+    <w:tmpl w:val="276A6EB8"/>
+    <w:lvl w:ilvl="0" w:tplc="040C0001">
+      <w:start w:val="1"/>
+      <w:numFmt w:val="bullet"/>
+      <w:lvlText w:val=""/>
+      <w:lvlJc w:val="left"/>
+      <w:pPr>
+        <w:ind w:left="1068" w:hanging="360"/>
+      </w:pPr>
+      <w:rPr>
+        <w:rFonts w:ascii="Symbol" w:hAnsi="Symbol" w:hint="default"/>
+      </w:rPr>
+    </w:lvl>
+    <w:lvl w:ilvl="1" w:tplc="040C0003" w:tentative="1">
+      <w:start w:val="1"/>
+      <w:numFmt w:val="bullet"/>
+      <w:lvlText w:val="o"/>
+      <w:lvlJc w:val="left"/>
+      <w:pPr>
+        <w:ind w:left="1788" w:hanging="360"/>
+      </w:pPr>
+      <w:rPr>
+        <w:rFonts w:ascii="Courier New" w:hAnsi="Courier New" w:cs="Courier New" w:hint="default"/>
+      </w:rPr>
+    </w:lvl>
+    <w:lvl w:ilvl="2" w:tplc="040C0005" w:tentative="1">
+      <w:start w:val="1"/>
+      <w:numFmt w:val="bullet"/>
+      <w:lvlText w:val=""/>
+      <w:lvlJc w:val="left"/>
+      <w:pPr>
+        <w:ind w:left="2508" w:hanging="360"/>
+      </w:pPr>
+      <w:rPr>
+        <w:rFonts w:ascii="Wingdings" w:hAnsi="Wingdings" w:hint="default"/>
+      </w:rPr>
+    </w:lvl>
+    <w:lvl w:ilvl="3" w:tplc="040C0001" w:tentative="1">
+      <w:start w:val="1"/>
+      <w:numFmt w:val="bullet"/>
+      <w:lvlText w:val=""/>
+      <w:lvlJc w:val="left"/>
+      <w:pPr>
+        <w:ind w:left="3228" w:hanging="360"/>
+      </w:pPr>
+      <w:rPr>
+        <w:rFonts w:ascii="Symbol" w:hAnsi="Symbol" w:hint="default"/>
+      </w:rPr>
+    </w:lvl>
+    <w:lvl w:ilvl="4" w:tplc="040C0003" w:tentative="1">
+      <w:start w:val="1"/>
+      <w:numFmt w:val="bullet"/>
+      <w:lvlText w:val="o"/>
+      <w:lvlJc w:val="left"/>
+      <w:pPr>
+        <w:ind w:left="3948" w:hanging="360"/>
+      </w:pPr>
+      <w:rPr>
+        <w:rFonts w:ascii="Courier New" w:hAnsi="Courier New" w:cs="Courier New" w:hint="default"/>
+      </w:rPr>
+    </w:lvl>
+    <w:lvl w:ilvl="5" w:tplc="040C0005" w:tentative="1">
+      <w:start w:val="1"/>
+      <w:numFmt w:val="bullet"/>
+      <w:lvlText w:val=""/>
+      <w:lvlJc w:val="left"/>
+      <w:pPr>
+        <w:ind w:left="4668" w:hanging="360"/>
+      </w:pPr>
+      <w:rPr>
+        <w:rFonts w:ascii="Wingdings" w:hAnsi="Wingdings" w:hint="default"/>
+      </w:rPr>
+    </w:lvl>
+    <w:lvl w:ilvl="6" w:tplc="040C0001" w:tentative="1">
+      <w:start w:val="1"/>
+      <w:numFmt w:val="bullet"/>
+      <w:lvlText w:val=""/>
+      <w:lvlJc w:val="left"/>
+      <w:pPr>
+        <w:ind w:left="5388" w:hanging="360"/>
+      </w:pPr>
+      <w:rPr>
+        <w:rFonts w:ascii="Symbol" w:hAnsi="Symbol" w:hint="default"/>
+      </w:rPr>
+    </w:lvl>
+    <w:lvl w:ilvl="7" w:tplc="040C0003" w:tentative="1">
+      <w:start w:val="1"/>
+      <w:numFmt w:val="bullet"/>
+      <w:lvlText w:val="o"/>
+      <w:lvlJc w:val="left"/>
+      <w:pPr>
+        <w:ind w:left="6108" w:hanging="360"/>
+      </w:pPr>
+      <w:rPr>
+        <w:rFonts w:ascii="Courier New" w:hAnsi="Courier New" w:cs="Courier New" w:hint="default"/>
+      </w:rPr>
+    </w:lvl>
+    <w:lvl w:ilvl="8" w:tplc="040C0005" w:tentative="1">
+      <w:start w:val="1"/>
+      <w:numFmt w:val="bullet"/>
+      <w:lvlText w:val=""/>
+      <w:lvlJc w:val="left"/>
+      <w:pPr>
+        <w:ind w:left="6828" w:hanging="360"/>
+      </w:pPr>
+      <w:rPr>
+        <w:rFonts w:ascii="Wingdings" w:hAnsi="Wingdings" w:hint="default"/>
+      </w:rPr>
+    </w:lvl>
+  </w:abstractNum>
+  <w:abstractNum w:abstractNumId="6" w15:restartNumberingAfterBreak="0">
+    <w:nsid w:val="5A5F31D5"/>
+    <w:multiLevelType w:val="hybridMultilevel"/>
+    <w:tmpl w:val="7408C766"/>
+    <w:lvl w:ilvl="0" w:tplc="040C0011">
+      <w:start w:val="1"/>
+      <w:numFmt w:val="decimal"/>
+      <w:lvlText w:val="%1)"/>
+      <w:lvlJc w:val="left"/>
+      <w:pPr>
+        <w:ind w:left="720" w:hanging="360"/>
+      </w:pPr>
+      <w:rPr>
+        <w:rFonts w:hint="default"/>
+      </w:rPr>
+    </w:lvl>
+    <w:lvl w:ilvl="1" w:tplc="040C0019" w:tentative="1">
+      <w:start w:val="1"/>
+      <w:numFmt w:val="lowerLetter"/>
+      <w:lvlText w:val="%2."/>
+      <w:lvlJc w:val="left"/>
+      <w:pPr>
         <w:ind w:left="1440" w:hanging="360"/>
       </w:pPr>
-      <w:rPr>
-        <w:rFonts w:ascii="Courier New" w:hAnsi="Courier New" w:cs="Courier New" w:hint="default"/>
-      </w:rPr>
-    </w:lvl>
-    <w:lvl w:ilvl="2" w:tplc="040C0005" w:tentative="1">
-      <w:start w:val="1"/>
-      <w:numFmt w:val="bullet"/>
-      <w:lvlText w:val=""/>
-      <w:lvlJc w:val="left"/>
-      <w:pPr>
-        <w:ind w:left="2160" w:hanging="360"/>
-      </w:pPr>
-      <w:rPr>
-        <w:rFonts w:ascii="Wingdings" w:hAnsi="Wingdings" w:hint="default"/>
-      </w:rPr>
-    </w:lvl>
-    <w:lvl w:ilvl="3" w:tplc="040C0001" w:tentative="1">
-      <w:start w:val="1"/>
-      <w:numFmt w:val="bullet"/>
-      <w:lvlText w:val=""/>
+    </w:lvl>
+    <w:lvl w:ilvl="2" w:tplc="040C001B" w:tentative="1">
+      <w:start w:val="1"/>
+      <w:numFmt w:val="lowerRoman"/>
+      <w:lvlText w:val="%3."/>
+      <w:lvlJc w:val="right"/>
+      <w:pPr>
+        <w:ind w:left="2160" w:hanging="180"/>
+      </w:pPr>
+    </w:lvl>
+    <w:lvl w:ilvl="3" w:tplc="040C000F" w:tentative="1">
+      <w:start w:val="1"/>
+      <w:numFmt w:val="decimal"/>
+      <w:lvlText w:val="%4."/>
       <w:lvlJc w:val="left"/>
       <w:pPr>
         <w:ind w:left="2880" w:hanging="360"/>
       </w:pPr>
-      <w:rPr>
-        <w:rFonts w:ascii="Symbol" w:hAnsi="Symbol" w:hint="default"/>
-      </w:rPr>
-    </w:lvl>
-    <w:lvl w:ilvl="4" w:tplc="040C0003" w:tentative="1">
-      <w:start w:val="1"/>
-      <w:numFmt w:val="bullet"/>
-      <w:lvlText w:val="o"/>
+    </w:lvl>
+    <w:lvl w:ilvl="4" w:tplc="040C0019" w:tentative="1">
+      <w:start w:val="1"/>
+      <w:numFmt w:val="lowerLetter"/>
+      <w:lvlText w:val="%5."/>
       <w:lvlJc w:val="left"/>
       <w:pPr>
         <w:ind w:left="3600" w:hanging="360"/>
       </w:pPr>
-      <w:rPr>
-        <w:rFonts w:ascii="Courier New" w:hAnsi="Courier New" w:cs="Courier New" w:hint="default"/>
-      </w:rPr>
-    </w:lvl>
-    <w:lvl w:ilvl="5" w:tplc="040C0005" w:tentative="1">
-      <w:start w:val="1"/>
-      <w:numFmt w:val="bullet"/>
-      <w:lvlText w:val=""/>
-      <w:lvlJc w:val="left"/>
-      <w:pPr>
-        <w:ind w:left="4320" w:hanging="360"/>
-      </w:pPr>
-      <w:rPr>
-        <w:rFonts w:ascii="Wingdings" w:hAnsi="Wingdings" w:hint="default"/>
-      </w:rPr>
-    </w:lvl>
-    <w:lvl w:ilvl="6" w:tplc="040C0001" w:tentative="1">
-      <w:start w:val="1"/>
-      <w:numFmt w:val="bullet"/>
-      <w:lvlText w:val=""/>
+    </w:lvl>
+    <w:lvl w:ilvl="5" w:tplc="040C001B" w:tentative="1">
+      <w:start w:val="1"/>
+      <w:numFmt w:val="lowerRoman"/>
+      <w:lvlText w:val="%6."/>
+      <w:lvlJc w:val="right"/>
+      <w:pPr>
+        <w:ind w:left="4320" w:hanging="180"/>
+      </w:pPr>
+    </w:lvl>
+    <w:lvl w:ilvl="6" w:tplc="040C000F" w:tentative="1">
+      <w:start w:val="1"/>
+      <w:numFmt w:val="decimal"/>
+      <w:lvlText w:val="%7."/>
       <w:lvlJc w:val="left"/>
       <w:pPr>
         <w:ind w:left="5040" w:hanging="360"/>
       </w:pPr>
-      <w:rPr>
-        <w:rFonts w:ascii="Symbol" w:hAnsi="Symbol" w:hint="default"/>
-      </w:rPr>
-    </w:lvl>
-    <w:lvl w:ilvl="7" w:tplc="040C0003" w:tentative="1">
-      <w:start w:val="1"/>
-      <w:numFmt w:val="bullet"/>
-      <w:lvlText w:val="o"/>
+    </w:lvl>
+    <w:lvl w:ilvl="7" w:tplc="040C0019" w:tentative="1">
+      <w:start w:val="1"/>
+      <w:numFmt w:val="lowerLetter"/>
+      <w:lvlText w:val="%8."/>
       <w:lvlJc w:val="left"/>
       <w:pPr>
         <w:ind w:left="5760" w:hanging="360"/>
       </w:pPr>
-      <w:rPr>
-        <w:rFonts w:ascii="Courier New" w:hAnsi="Courier New" w:cs="Courier New" w:hint="default"/>
-      </w:rPr>
-    </w:lvl>
-    <w:lvl w:ilvl="8" w:tplc="040C0005" w:tentative="1">
-      <w:start w:val="1"/>
-      <w:numFmt w:val="bullet"/>
-      <w:lvlText w:val=""/>
-      <w:lvlJc w:val="left"/>
-      <w:pPr>
-        <w:ind w:left="6480" w:hanging="360"/>
-      </w:pPr>
-      <w:rPr>
-        <w:rFonts w:ascii="Wingdings" w:hAnsi="Wingdings" w:hint="default"/>
-      </w:rPr>
+    </w:lvl>
+    <w:lvl w:ilvl="8" w:tplc="040C001B" w:tentative="1">
+      <w:start w:val="1"/>
+      <w:numFmt w:val="lowerRoman"/>
+      <w:lvlText w:val="%9."/>
+      <w:lvlJc w:val="right"/>
+      <w:pPr>
+        <w:ind w:left="6480" w:hanging="180"/>
+      </w:pPr>
     </w:lvl>
   </w:abstractNum>
   <w:num w:numId="1">
@@ -894,6 +2259,18 @@
   </w:num>
   <w:num w:numId="3">
     <w:abstractNumId w:val="2"/>
+  </w:num>
+  <w:num w:numId="4">
+    <w:abstractNumId w:val="6"/>
+  </w:num>
+  <w:num w:numId="5">
+    <w:abstractNumId w:val="3"/>
+  </w:num>
+  <w:num w:numId="6">
+    <w:abstractNumId w:val="4"/>
+  </w:num>
+  <w:num w:numId="7">
+    <w:abstractNumId w:val="5"/>
   </w:num>
 </w:numbering>
 </file>

</xml_diff>